<commit_message>
feat: integrate expanded mob roster and exact Tripo models
Adds dedicated entities, boss combat systems, exact textured runtime meshes, model conversion tooling, regression tests, and an updated Word mob status list. Preserves QA status for models that still require isolated in-game visual review.
</commit_message>
<xml_diff>
--- a/Mobliste.docx
+++ b/Mobliste.docx
@@ -4030,6 +4030,1448 @@
         <w:t>4. Später: Hexenboss und Hilfsgeist als größere Content-Pieces.</w:t>
       </w:r>
     </w:p>
+    <w:p>
+      <w:pPr>
+        <w:pStyle w:val="berschrift1"/>
+        <w:spacing w:before="240" w:after="120"/>
+      </w:pPr>
+      <w:r>
+        <w:t>Projektstand 24.08.2026</w:t>
+      </w:r>
+    </w:p>
+    <w:p>
+      <w:pPr>
+        <w:spacing w:after="160"/>
+      </w:pPr>
+      <w:r>
+        <w:t>Dieser Nachtrag dokumentiert den tatsächlich eingebundenen Projektstand. Status ‚QA‘ bedeutet: Code und Laufzeitressourcen sind vorhanden, die abschliessende isolierte Ingame-Sichtprüfung ist noch offen.</w:t>
+      </w:r>
+    </w:p>
+    <w:tbl>
+      <w:tblPr>
+        <w:tblStyle w:val="Tabellenraster"/>
+        <w:tblW w:type="auto" w:w="0"/>
+        <w:tblLayout w:type="fixed"/>
+        <w:tblLook w:firstColumn="1" w:firstRow="1" w:lastColumn="0" w:lastRow="0" w:noHBand="0" w:noVBand="1" w:val="04A0"/>
+      </w:tblPr>
+      <w:tblGrid>
+        <w:gridCol w:w="2472"/>
+        <w:gridCol w:w="2472"/>
+        <w:gridCol w:w="2472"/>
+        <w:gridCol w:w="2472"/>
+      </w:tblGrid>
+      <w:tr>
+        <w:trPr>
+          <w:tblHeader w:val="true"/>
+        </w:trPr>
+        <w:tc>
+          <w:tcPr>
+            <w:tcW w:type="dxa" w:w="1584"/>
+            <w:shd w:fill="273449"/>
+            <w:vAlign w:val="center"/>
+          </w:tcPr>
+          <w:p>
+            <w:pPr>
+              <w:spacing w:after="0" w:before="0"/>
+              <w:jc w:val="center"/>
+            </w:pPr>
+            <w:r>
+              <w:rPr>
+                <w:rFonts w:ascii="Aptos" w:hAnsi="Aptos"/>
+                <w:b/>
+                <w:color w:val="FFFFFF"/>
+                <w:sz w:val="18"/>
+              </w:rPr>
+              <w:t>Mob</w:t>
+            </w:r>
+          </w:p>
+        </w:tc>
+        <w:tc>
+          <w:tcPr>
+            <w:tcW w:type="dxa" w:w="1440"/>
+            <w:shd w:fill="273449"/>
+            <w:vAlign w:val="center"/>
+          </w:tcPr>
+          <w:p>
+            <w:pPr>
+              <w:spacing w:after="0" w:before="0"/>
+              <w:jc w:val="center"/>
+            </w:pPr>
+            <w:r>
+              <w:rPr>
+                <w:rFonts w:ascii="Aptos" w:hAnsi="Aptos"/>
+                <w:b/>
+                <w:color w:val="FFFFFF"/>
+                <w:sz w:val="18"/>
+              </w:rPr>
+              <w:t>Status</w:t>
+            </w:r>
+          </w:p>
+        </w:tc>
+        <w:tc>
+          <w:tcPr>
+            <w:tcW w:type="dxa" w:w="3312"/>
+            <w:shd w:fill="273449"/>
+            <w:vAlign w:val="center"/>
+          </w:tcPr>
+          <w:p>
+            <w:pPr>
+              <w:spacing w:after="0" w:before="0"/>
+              <w:jc w:val="left"/>
+            </w:pPr>
+            <w:r>
+              <w:rPr>
+                <w:rFonts w:ascii="Aptos" w:hAnsi="Aptos"/>
+                <w:b/>
+                <w:color w:val="FFFFFF"/>
+                <w:sz w:val="18"/>
+              </w:rPr>
+              <w:t>Aktueller Stand</w:t>
+            </w:r>
+          </w:p>
+        </w:tc>
+        <w:tc>
+          <w:tcPr>
+            <w:tcW w:type="dxa" w:w="3024"/>
+            <w:shd w:fill="273449"/>
+            <w:vAlign w:val="center"/>
+          </w:tcPr>
+          <w:p>
+            <w:pPr>
+              <w:spacing w:after="0" w:before="0"/>
+              <w:jc w:val="left"/>
+            </w:pPr>
+            <w:r>
+              <w:rPr>
+                <w:rFonts w:ascii="Aptos" w:hAnsi="Aptos"/>
+                <w:b/>
+                <w:color w:val="FFFFFF"/>
+                <w:sz w:val="18"/>
+              </w:rPr>
+              <w:t>Nächste Qualitätsprüfung</w:t>
+            </w:r>
+          </w:p>
+        </w:tc>
+      </w:tr>
+      <w:tr>
+        <w:tc>
+          <w:tcPr>
+            <w:tcW w:type="dxa" w:w="1584"/>
+            <w:vAlign w:val="center"/>
+          </w:tcPr>
+          <w:p>
+            <w:pPr>
+              <w:spacing w:after="0" w:before="0"/>
+              <w:jc w:val="left"/>
+            </w:pPr>
+            <w:r>
+              <w:rPr>
+                <w:rFonts w:ascii="Aptos" w:hAnsi="Aptos"/>
+                <w:b/>
+                <w:color w:val="1F2937"/>
+                <w:sz w:val="18"/>
+              </w:rPr>
+              <w:t>Korrumpierter Silberfisch</w:t>
+            </w:r>
+          </w:p>
+        </w:tc>
+        <w:tc>
+          <w:tcPr>
+            <w:tcW w:type="dxa" w:w="1440"/>
+            <w:vAlign w:val="center"/>
+          </w:tcPr>
+          <w:p>
+            <w:pPr>
+              <w:spacing w:after="0" w:before="0"/>
+              <w:jc w:val="center"/>
+            </w:pPr>
+            <w:r>
+              <w:rPr>
+                <w:rFonts w:ascii="Aptos" w:hAnsi="Aptos"/>
+                <w:b w:val="0"/>
+                <w:color w:val="1F2937"/>
+                <w:sz w:val="18"/>
+              </w:rPr>
+              <w:t>AKTIV / REFERENZ</w:t>
+            </w:r>
+          </w:p>
+        </w:tc>
+        <w:tc>
+          <w:tcPr>
+            <w:tcW w:type="dxa" w:w="3312"/>
+            <w:vAlign w:val="center"/>
+          </w:tcPr>
+          <w:p>
+            <w:pPr>
+              <w:spacing w:after="0" w:before="0"/>
+              <w:jc w:val="left"/>
+            </w:pPr>
+            <w:r>
+              <w:rPr>
+                <w:rFonts w:ascii="Aptos" w:hAnsi="Aptos"/>
+                <w:b w:val="0"/>
+                <w:color w:val="1F2937"/>
+                <w:sz w:val="18"/>
+              </w:rPr>
+              <w:t>Aktives V5-Spielmodell, Textur, Animation, Sounds und Multipart-Hitbox sind eingebunden und durch den Projektprüfer validiert.</w:t>
+            </w:r>
+          </w:p>
+        </w:tc>
+        <w:tc>
+          <w:tcPr>
+            <w:tcW w:type="dxa" w:w="3024"/>
+            <w:vAlign w:val="center"/>
+          </w:tcPr>
+          <w:p>
+            <w:pPr>
+              <w:spacing w:after="0" w:before="0"/>
+              <w:jc w:val="left"/>
+            </w:pPr>
+            <w:r>
+              <w:rPr>
+                <w:rFonts w:ascii="Aptos" w:hAnsi="Aptos"/>
+                <w:b w:val="0"/>
+                <w:color w:val="1F2937"/>
+                <w:sz w:val="18"/>
+              </w:rPr>
+              <w:t>Weitere Ingame-Politur nur nach Vergleichsbild.</w:t>
+            </w:r>
+          </w:p>
+        </w:tc>
+      </w:tr>
+      <w:tr>
+        <w:tc>
+          <w:tcPr>
+            <w:tcW w:type="dxa" w:w="1584"/>
+            <w:shd w:fill="EEF3F8"/>
+            <w:vAlign w:val="center"/>
+          </w:tcPr>
+          <w:p>
+            <w:pPr>
+              <w:spacing w:after="0" w:before="0"/>
+              <w:jc w:val="left"/>
+            </w:pPr>
+            <w:r>
+              <w:rPr>
+                <w:rFonts w:ascii="Aptos" w:hAnsi="Aptos"/>
+                <w:b/>
+                <w:color w:val="1F2937"/>
+                <w:sz w:val="18"/>
+              </w:rPr>
+              <w:t>Frost Stray</w:t>
+            </w:r>
+          </w:p>
+        </w:tc>
+        <w:tc>
+          <w:tcPr>
+            <w:tcW w:type="dxa" w:w="1440"/>
+            <w:shd w:fill="EEF3F8"/>
+            <w:vAlign w:val="center"/>
+          </w:tcPr>
+          <w:p>
+            <w:pPr>
+              <w:spacing w:after="0" w:before="0"/>
+              <w:jc w:val="center"/>
+            </w:pPr>
+            <w:r>
+              <w:rPr>
+                <w:rFonts w:ascii="Aptos" w:hAnsi="Aptos"/>
+                <w:b w:val="0"/>
+                <w:color w:val="1F2937"/>
+                <w:sz w:val="18"/>
+              </w:rPr>
+              <w:t>NEU GENERIERT</w:t>
+            </w:r>
+          </w:p>
+        </w:tc>
+        <w:tc>
+          <w:tcPr>
+            <w:tcW w:type="dxa" w:w="3312"/>
+            <w:shd w:fill="EEF3F8"/>
+            <w:vAlign w:val="center"/>
+          </w:tcPr>
+          <w:p>
+            <w:pPr>
+              <w:spacing w:after="0" w:before="0"/>
+              <w:jc w:val="left"/>
+            </w:pPr>
+            <w:r>
+              <w:rPr>
+                <w:rFonts w:ascii="Aptos" w:hAnsi="Aptos"/>
+                <w:b w:val="0"/>
+                <w:color w:val="1F2937"/>
+                <w:sz w:val="18"/>
+              </w:rPr>
+              <w:t>Komplett neues Tripo-v3.1-Modell mit 4K-Textur; exakter Mesh-Export mit 714'146 Dreiecken und sechs animierbaren Körperregionen.</w:t>
+            </w:r>
+          </w:p>
+        </w:tc>
+        <w:tc>
+          <w:tcPr>
+            <w:tcW w:type="dxa" w:w="3024"/>
+            <w:shd w:fill="EEF3F8"/>
+            <w:vAlign w:val="center"/>
+          </w:tcPr>
+          <w:p>
+            <w:pPr>
+              <w:spacing w:after="0" w:before="0"/>
+              <w:jc w:val="left"/>
+            </w:pPr>
+            <w:r>
+              <w:rPr>
+                <w:rFonts w:ascii="Aptos" w:hAnsi="Aptos"/>
+                <w:b w:val="0"/>
+                <w:color w:val="1F2937"/>
+                <w:sz w:val="18"/>
+              </w:rPr>
+              <w:t>Abschliessende isolierte Ingame-Sichtprüfung von Grösse und Bodenhöhe.</w:t>
+            </w:r>
+          </w:p>
+        </w:tc>
+      </w:tr>
+      <w:tr>
+        <w:tc>
+          <w:tcPr>
+            <w:tcW w:type="dxa" w:w="1584"/>
+            <w:vAlign w:val="center"/>
+          </w:tcPr>
+          <w:p>
+            <w:pPr>
+              <w:spacing w:after="0" w:before="0"/>
+              <w:jc w:val="left"/>
+            </w:pPr>
+            <w:r>
+              <w:rPr>
+                <w:rFonts w:ascii="Aptos" w:hAnsi="Aptos"/>
+                <w:b/>
+                <w:color w:val="1F2937"/>
+                <w:sz w:val="18"/>
+              </w:rPr>
+              <w:t>Coral Drowned</w:t>
+            </w:r>
+          </w:p>
+        </w:tc>
+        <w:tc>
+          <w:tcPr>
+            <w:tcW w:type="dxa" w:w="1440"/>
+            <w:vAlign w:val="center"/>
+          </w:tcPr>
+          <w:p>
+            <w:pPr>
+              <w:spacing w:after="0" w:before="0"/>
+              <w:jc w:val="center"/>
+            </w:pPr>
+            <w:r>
+              <w:rPr>
+                <w:rFonts w:ascii="Aptos" w:hAnsi="Aptos"/>
+                <w:b w:val="0"/>
+                <w:color w:val="1F2937"/>
+                <w:sz w:val="18"/>
+              </w:rPr>
+              <w:t>NEU GENERIERT</w:t>
+            </w:r>
+          </w:p>
+        </w:tc>
+        <w:tc>
+          <w:tcPr>
+            <w:tcW w:type="dxa" w:w="3312"/>
+            <w:vAlign w:val="center"/>
+          </w:tcPr>
+          <w:p>
+            <w:pPr>
+              <w:spacing w:after="0" w:before="0"/>
+              <w:jc w:val="left"/>
+            </w:pPr>
+            <w:r>
+              <w:rPr>
+                <w:rFonts w:ascii="Aptos" w:hAnsi="Aptos"/>
+                <w:b w:val="0"/>
+                <w:color w:val="1F2937"/>
+                <w:sz w:val="18"/>
+              </w:rPr>
+              <w:t>Komplett neues Tripo-v3.1-Modell mit 4K-Textur; exakter Mesh-Export mit 728'013 Dreiecken und sechs animierbaren Körperregionen.</w:t>
+            </w:r>
+          </w:p>
+        </w:tc>
+        <w:tc>
+          <w:tcPr>
+            <w:tcW w:type="dxa" w:w="3024"/>
+            <w:vAlign w:val="center"/>
+          </w:tcPr>
+          <w:p>
+            <w:pPr>
+              <w:spacing w:after="0" w:before="0"/>
+              <w:jc w:val="left"/>
+            </w:pPr>
+            <w:r>
+              <w:rPr>
+                <w:rFonts w:ascii="Aptos" w:hAnsi="Aptos"/>
+                <w:b w:val="0"/>
+                <w:color w:val="1F2937"/>
+                <w:sz w:val="18"/>
+              </w:rPr>
+              <w:t>Abschliessende isolierte Ingame-Sichtprüfung von Vorderseite, Grösse und Bodenhöhe.</w:t>
+            </w:r>
+          </w:p>
+        </w:tc>
+      </w:tr>
+      <w:tr>
+        <w:tc>
+          <w:tcPr>
+            <w:tcW w:type="dxa" w:w="1584"/>
+            <w:shd w:fill="EEF3F8"/>
+            <w:vAlign w:val="center"/>
+          </w:tcPr>
+          <w:p>
+            <w:pPr>
+              <w:spacing w:after="0" w:before="0"/>
+              <w:jc w:val="left"/>
+            </w:pPr>
+            <w:r>
+              <w:rPr>
+                <w:rFonts w:ascii="Aptos" w:hAnsi="Aptos"/>
+                <w:b/>
+                <w:color w:val="1F2937"/>
+                <w:sz w:val="18"/>
+              </w:rPr>
+              <w:t>Living Axolotl</w:t>
+            </w:r>
+          </w:p>
+        </w:tc>
+        <w:tc>
+          <w:tcPr>
+            <w:tcW w:type="dxa" w:w="1440"/>
+            <w:shd w:fill="EEF3F8"/>
+            <w:vAlign w:val="center"/>
+          </w:tcPr>
+          <w:p>
+            <w:pPr>
+              <w:spacing w:after="0" w:before="0"/>
+              <w:jc w:val="center"/>
+            </w:pPr>
+            <w:r>
+              <w:rPr>
+                <w:rFonts w:ascii="Aptos" w:hAnsi="Aptos"/>
+                <w:b w:val="0"/>
+                <w:color w:val="1F2937"/>
+                <w:sz w:val="18"/>
+              </w:rPr>
+              <w:t>NEU GENERIERT</w:t>
+            </w:r>
+          </w:p>
+        </w:tc>
+        <w:tc>
+          <w:tcPr>
+            <w:tcW w:type="dxa" w:w="3312"/>
+            <w:shd w:fill="EEF3F8"/>
+            <w:vAlign w:val="center"/>
+          </w:tcPr>
+          <w:p>
+            <w:pPr>
+              <w:spacing w:after="0" w:before="0"/>
+              <w:jc w:val="left"/>
+            </w:pPr>
+            <w:r>
+              <w:rPr>
+                <w:rFonts w:ascii="Aptos" w:hAnsi="Aptos"/>
+                <w:b w:val="0"/>
+                <w:color w:val="1F2937"/>
+                <w:sz w:val="18"/>
+              </w:rPr>
+              <w:t>Komplett neues langes Axolotl-Modell mit symmetrischen Kiemen und 4K-Textur; 733'834 Dreiecke und sieben animierbare Körperregionen.</w:t>
+            </w:r>
+          </w:p>
+        </w:tc>
+        <w:tc>
+          <w:tcPr>
+            <w:tcW w:type="dxa" w:w="3024"/>
+            <w:shd w:fill="EEF3F8"/>
+            <w:vAlign w:val="center"/>
+          </w:tcPr>
+          <w:p>
+            <w:pPr>
+              <w:spacing w:after="0" w:before="0"/>
+              <w:jc w:val="left"/>
+            </w:pPr>
+            <w:r>
+              <w:rPr>
+                <w:rFonts w:ascii="Aptos" w:hAnsi="Aptos"/>
+                <w:b w:val="0"/>
+                <w:color w:val="1F2937"/>
+                <w:sz w:val="18"/>
+              </w:rPr>
+              <w:t>Abschliessende isolierte Ingame-Sichtprüfung von Körperachse, Grösse und Bodenhöhe.</w:t>
+            </w:r>
+          </w:p>
+        </w:tc>
+      </w:tr>
+      <w:tr>
+        <w:tc>
+          <w:tcPr>
+            <w:tcW w:type="dxa" w:w="1584"/>
+            <w:vAlign w:val="center"/>
+          </w:tcPr>
+          <w:p>
+            <w:pPr>
+              <w:spacing w:after="0" w:before="0"/>
+              <w:jc w:val="left"/>
+            </w:pPr>
+            <w:r>
+              <w:rPr>
+                <w:rFonts w:ascii="Aptos" w:hAnsi="Aptos"/>
+                <w:b/>
+                <w:color w:val="1F2937"/>
+                <w:sz w:val="18"/>
+              </w:rPr>
+              <w:t>Living Polar Bear</w:t>
+            </w:r>
+          </w:p>
+        </w:tc>
+        <w:tc>
+          <w:tcPr>
+            <w:tcW w:type="dxa" w:w="1440"/>
+            <w:vAlign w:val="center"/>
+          </w:tcPr>
+          <w:p>
+            <w:pPr>
+              <w:spacing w:after="0" w:before="0"/>
+              <w:jc w:val="center"/>
+            </w:pPr>
+            <w:r>
+              <w:rPr>
+                <w:rFonts w:ascii="Aptos" w:hAnsi="Aptos"/>
+                <w:b w:val="0"/>
+                <w:color w:val="1F2937"/>
+                <w:sz w:val="18"/>
+              </w:rPr>
+              <w:t>EINGEBUNDEN</w:t>
+            </w:r>
+          </w:p>
+        </w:tc>
+        <w:tc>
+          <w:tcPr>
+            <w:tcW w:type="dxa" w:w="3312"/>
+            <w:vAlign w:val="center"/>
+          </w:tcPr>
+          <w:p>
+            <w:pPr>
+              <w:spacing w:after="0" w:before="0"/>
+              <w:jc w:val="left"/>
+            </w:pPr>
+            <w:r>
+              <w:rPr>
+                <w:rFonts w:ascii="Aptos" w:hAnsi="Aptos"/>
+                <w:b w:val="0"/>
+                <w:color w:val="1F2937"/>
+                <w:sz w:val="18"/>
+              </w:rPr>
+              <w:t>Eigenes Entity-, Spawn-Ei-, Renderer-, Mesh- und Texturpaket ist vorhanden.</w:t>
+            </w:r>
+          </w:p>
+        </w:tc>
+        <w:tc>
+          <w:tcPr>
+            <w:tcW w:type="dxa" w:w="3024"/>
+            <w:vAlign w:val="center"/>
+          </w:tcPr>
+          <w:p>
+            <w:pPr>
+              <w:spacing w:after="0" w:before="0"/>
+              <w:jc w:val="left"/>
+            </w:pPr>
+            <w:r>
+              <w:rPr>
+                <w:rFonts w:ascii="Aptos" w:hAnsi="Aptos"/>
+                <w:b w:val="0"/>
+                <w:color w:val="1F2937"/>
+                <w:sz w:val="18"/>
+              </w:rPr>
+              <w:t>Das vermeintliche schwebende Gesicht gehörte zum benachbarten Oktopus. Die Galerie blendet Nachbarmobs nun aus; Eisbär-Mesh nicht unnötig beschädigen.</w:t>
+            </w:r>
+          </w:p>
+        </w:tc>
+      </w:tr>
+      <w:tr>
+        <w:tc>
+          <w:tcPr>
+            <w:tcW w:type="dxa" w:w="1584"/>
+            <w:shd w:fill="EEF3F8"/>
+            <w:vAlign w:val="center"/>
+          </w:tcPr>
+          <w:p>
+            <w:pPr>
+              <w:spacing w:after="0" w:before="0"/>
+              <w:jc w:val="left"/>
+            </w:pPr>
+            <w:r>
+              <w:rPr>
+                <w:rFonts w:ascii="Aptos" w:hAnsi="Aptos"/>
+                <w:b/>
+                <w:color w:val="1F2937"/>
+                <w:sz w:val="18"/>
+              </w:rPr>
+              <w:t>Helping Allay</w:t>
+            </w:r>
+          </w:p>
+        </w:tc>
+        <w:tc>
+          <w:tcPr>
+            <w:tcW w:type="dxa" w:w="1440"/>
+            <w:shd w:fill="EEF3F8"/>
+            <w:vAlign w:val="center"/>
+          </w:tcPr>
+          <w:p>
+            <w:pPr>
+              <w:spacing w:after="0" w:before="0"/>
+              <w:jc w:val="center"/>
+            </w:pPr>
+            <w:r>
+              <w:rPr>
+                <w:rFonts w:ascii="Aptos" w:hAnsi="Aptos"/>
+                <w:b w:val="0"/>
+                <w:color w:val="1F2937"/>
+                <w:sz w:val="18"/>
+              </w:rPr>
+              <w:t>EINGEBUNDEN / QA</w:t>
+            </w:r>
+          </w:p>
+        </w:tc>
+        <w:tc>
+          <w:tcPr>
+            <w:tcW w:type="dxa" w:w="3312"/>
+            <w:shd w:fill="EEF3F8"/>
+            <w:vAlign w:val="center"/>
+          </w:tcPr>
+          <w:p>
+            <w:pPr>
+              <w:spacing w:after="0" w:before="0"/>
+              <w:jc w:val="left"/>
+            </w:pPr>
+            <w:r>
+              <w:rPr>
+                <w:rFonts w:ascii="Aptos" w:hAnsi="Aptos"/>
+                <w:b w:val="0"/>
+                <w:color w:val="1F2937"/>
+                <w:sz w:val="18"/>
+              </w:rPr>
+              <w:t>Eigenes Entity, Spawn-Ei und Exact-Layer sind vorhanden.</w:t>
+            </w:r>
+          </w:p>
+        </w:tc>
+        <w:tc>
+          <w:tcPr>
+            <w:tcW w:type="dxa" w:w="3024"/>
+            <w:shd w:fill="EEF3F8"/>
+            <w:vAlign w:val="center"/>
+          </w:tcPr>
+          <w:p>
+            <w:pPr>
+              <w:spacing w:after="0" w:before="0"/>
+              <w:jc w:val="left"/>
+            </w:pPr>
+            <w:r>
+              <w:rPr>
+                <w:rFonts w:ascii="Aptos" w:hAnsi="Aptos"/>
+                <w:b w:val="0"/>
+                <w:color w:val="1F2937"/>
+                <w:sz w:val="18"/>
+              </w:rPr>
+              <w:t>Visuelle Ingame-Prüfung und gegebenenfalls Achsen-/Rig-Korrektur.</w:t>
+            </w:r>
+          </w:p>
+        </w:tc>
+      </w:tr>
+      <w:tr>
+        <w:tc>
+          <w:tcPr>
+            <w:tcW w:type="dxa" w:w="1584"/>
+            <w:vAlign w:val="center"/>
+          </w:tcPr>
+          <w:p>
+            <w:pPr>
+              <w:spacing w:after="0" w:before="0"/>
+              <w:jc w:val="left"/>
+            </w:pPr>
+            <w:r>
+              <w:rPr>
+                <w:rFonts w:ascii="Aptos" w:hAnsi="Aptos"/>
+                <w:b/>
+                <w:color w:val="1F2937"/>
+                <w:sz w:val="18"/>
+              </w:rPr>
+              <w:t>Oktopus</w:t>
+            </w:r>
+          </w:p>
+        </w:tc>
+        <w:tc>
+          <w:tcPr>
+            <w:tcW w:type="dxa" w:w="1440"/>
+            <w:vAlign w:val="center"/>
+          </w:tcPr>
+          <w:p>
+            <w:pPr>
+              <w:spacing w:after="0" w:before="0"/>
+              <w:jc w:val="center"/>
+            </w:pPr>
+            <w:r>
+              <w:rPr>
+                <w:rFonts w:ascii="Aptos" w:hAnsi="Aptos"/>
+                <w:b w:val="0"/>
+                <w:color w:val="1F2937"/>
+                <w:sz w:val="18"/>
+              </w:rPr>
+              <w:t>EINGEBUNDEN / QA</w:t>
+            </w:r>
+          </w:p>
+        </w:tc>
+        <w:tc>
+          <w:tcPr>
+            <w:tcW w:type="dxa" w:w="3312"/>
+            <w:vAlign w:val="center"/>
+          </w:tcPr>
+          <w:p>
+            <w:pPr>
+              <w:spacing w:after="0" w:before="0"/>
+              <w:jc w:val="left"/>
+            </w:pPr>
+            <w:r>
+              <w:rPr>
+                <w:rFonts w:ascii="Aptos" w:hAnsi="Aptos"/>
+                <w:b w:val="0"/>
+                <w:color w:val="1F2937"/>
+                <w:sz w:val="18"/>
+              </w:rPr>
+              <w:t>Eigenes Entity, Renderer, Modell, Textur, Wasser-KI und Sounds sind vorhanden.</w:t>
+            </w:r>
+          </w:p>
+        </w:tc>
+        <w:tc>
+          <w:tcPr>
+            <w:tcW w:type="dxa" w:w="3024"/>
+            <w:vAlign w:val="center"/>
+          </w:tcPr>
+          <w:p>
+            <w:pPr>
+              <w:spacing w:after="0" w:before="0"/>
+              <w:jc w:val="left"/>
+            </w:pPr>
+            <w:r>
+              <w:rPr>
+                <w:rFonts w:ascii="Aptos" w:hAnsi="Aptos"/>
+                <w:b w:val="0"/>
+                <w:color w:val="1F2937"/>
+                <w:sz w:val="18"/>
+              </w:rPr>
+              <w:t>Isolation in der Modellgalerie und natürliche Tentakelanimation prüfen.</w:t>
+            </w:r>
+          </w:p>
+        </w:tc>
+      </w:tr>
+      <w:tr>
+        <w:tc>
+          <w:tcPr>
+            <w:tcW w:type="dxa" w:w="1584"/>
+            <w:shd w:fill="EEF3F8"/>
+            <w:vAlign w:val="center"/>
+          </w:tcPr>
+          <w:p>
+            <w:pPr>
+              <w:spacing w:after="0" w:before="0"/>
+              <w:jc w:val="left"/>
+            </w:pPr>
+            <w:r>
+              <w:rPr>
+                <w:rFonts w:ascii="Aptos" w:hAnsi="Aptos"/>
+                <w:b/>
+                <w:color w:val="1F2937"/>
+                <w:sz w:val="18"/>
+              </w:rPr>
+              <w:t>Squid / Kalmar</w:t>
+            </w:r>
+          </w:p>
+        </w:tc>
+        <w:tc>
+          <w:tcPr>
+            <w:tcW w:type="dxa" w:w="1440"/>
+            <w:shd w:fill="EEF3F8"/>
+            <w:vAlign w:val="center"/>
+          </w:tcPr>
+          <w:p>
+            <w:pPr>
+              <w:spacing w:after="0" w:before="0"/>
+              <w:jc w:val="center"/>
+            </w:pPr>
+            <w:r>
+              <w:rPr>
+                <w:rFonts w:ascii="Aptos" w:hAnsi="Aptos"/>
+                <w:b w:val="0"/>
+                <w:color w:val="1F2937"/>
+                <w:sz w:val="18"/>
+              </w:rPr>
+              <w:t>EINGEBUNDEN / QA</w:t>
+            </w:r>
+          </w:p>
+        </w:tc>
+        <w:tc>
+          <w:tcPr>
+            <w:tcW w:type="dxa" w:w="3312"/>
+            <w:shd w:fill="EEF3F8"/>
+            <w:vAlign w:val="center"/>
+          </w:tcPr>
+          <w:p>
+            <w:pPr>
+              <w:spacing w:after="0" w:before="0"/>
+              <w:jc w:val="left"/>
+            </w:pPr>
+            <w:r>
+              <w:rPr>
+                <w:rFonts w:ascii="Aptos" w:hAnsi="Aptos"/>
+                <w:b w:val="0"/>
+                <w:color w:val="1F2937"/>
+                <w:sz w:val="18"/>
+              </w:rPr>
+              <w:t>Eigene Living-Squid-Variante mit Spawn-Ei, Renderer, Mesh und Textur ist vorhanden.</w:t>
+            </w:r>
+          </w:p>
+        </w:tc>
+        <w:tc>
+          <w:tcPr>
+            <w:tcW w:type="dxa" w:w="3024"/>
+            <w:shd w:fill="EEF3F8"/>
+            <w:vAlign w:val="center"/>
+          </w:tcPr>
+          <w:p>
+            <w:pPr>
+              <w:spacing w:after="0" w:before="0"/>
+              <w:jc w:val="left"/>
+            </w:pPr>
+            <w:r>
+              <w:rPr>
+                <w:rFonts w:ascii="Aptos" w:hAnsi="Aptos"/>
+                <w:b w:val="0"/>
+                <w:color w:val="1F2937"/>
+                <w:sz w:val="18"/>
+              </w:rPr>
+              <w:t>Grösse, acht Arme plus zwei Fangtentakel und Schwimmanimation prüfen.</w:t>
+            </w:r>
+          </w:p>
+        </w:tc>
+      </w:tr>
+      <w:tr>
+        <w:tc>
+          <w:tcPr>
+            <w:tcW w:type="dxa" w:w="1584"/>
+            <w:vAlign w:val="center"/>
+          </w:tcPr>
+          <w:p>
+            <w:pPr>
+              <w:spacing w:after="0" w:before="0"/>
+              <w:jc w:val="left"/>
+            </w:pPr>
+            <w:r>
+              <w:rPr>
+                <w:rFonts w:ascii="Aptos" w:hAnsi="Aptos"/>
+                <w:b/>
+                <w:color w:val="1F2937"/>
+                <w:sz w:val="18"/>
+              </w:rPr>
+              <w:t>Glow Squid</w:t>
+            </w:r>
+          </w:p>
+        </w:tc>
+        <w:tc>
+          <w:tcPr>
+            <w:tcW w:type="dxa" w:w="1440"/>
+            <w:vAlign w:val="center"/>
+          </w:tcPr>
+          <w:p>
+            <w:pPr>
+              <w:spacing w:after="0" w:before="0"/>
+              <w:jc w:val="center"/>
+            </w:pPr>
+            <w:r>
+              <w:rPr>
+                <w:rFonts w:ascii="Aptos" w:hAnsi="Aptos"/>
+                <w:b w:val="0"/>
+                <w:color w:val="1F2937"/>
+                <w:sz w:val="18"/>
+              </w:rPr>
+              <w:t>EINGEBUNDEN / QA</w:t>
+            </w:r>
+          </w:p>
+        </w:tc>
+        <w:tc>
+          <w:tcPr>
+            <w:tcW w:type="dxa" w:w="3312"/>
+            <w:vAlign w:val="center"/>
+          </w:tcPr>
+          <w:p>
+            <w:pPr>
+              <w:spacing w:after="0" w:before="0"/>
+              <w:jc w:val="left"/>
+            </w:pPr>
+            <w:r>
+              <w:rPr>
+                <w:rFonts w:ascii="Aptos" w:hAnsi="Aptos"/>
+                <w:b w:val="0"/>
+                <w:color w:val="1F2937"/>
+                <w:sz w:val="18"/>
+              </w:rPr>
+              <w:t>Eigene Living-Glow-Squid-Variante mit Spawn-Ei, Renderer, Mesh und Textur ist vorhanden.</w:t>
+            </w:r>
+          </w:p>
+        </w:tc>
+        <w:tc>
+          <w:tcPr>
+            <w:tcW w:type="dxa" w:w="3024"/>
+            <w:vAlign w:val="center"/>
+          </w:tcPr>
+          <w:p>
+            <w:pPr>
+              <w:spacing w:after="0" w:before="0"/>
+              <w:jc w:val="left"/>
+            </w:pPr>
+            <w:r>
+              <w:rPr>
+                <w:rFonts w:ascii="Aptos" w:hAnsi="Aptos"/>
+                <w:b w:val="0"/>
+                <w:color w:val="1F2937"/>
+                <w:sz w:val="18"/>
+              </w:rPr>
+              <w:t>Blend-/Lichteffekt und Ingame-Grösse prüfen.</w:t>
+            </w:r>
+          </w:p>
+        </w:tc>
+      </w:tr>
+      <w:tr>
+        <w:tc>
+          <w:tcPr>
+            <w:tcW w:type="dxa" w:w="1584"/>
+            <w:shd w:fill="EEF3F8"/>
+            <w:vAlign w:val="center"/>
+          </w:tcPr>
+          <w:p>
+            <w:pPr>
+              <w:spacing w:after="0" w:before="0"/>
+              <w:jc w:val="left"/>
+            </w:pPr>
+            <w:r>
+              <w:rPr>
+                <w:rFonts w:ascii="Aptos" w:hAnsi="Aptos"/>
+                <w:b/>
+                <w:color w:val="1F2937"/>
+                <w:sz w:val="18"/>
+              </w:rPr>
+              <w:t>Living Ocelot</w:t>
+            </w:r>
+          </w:p>
+        </w:tc>
+        <w:tc>
+          <w:tcPr>
+            <w:tcW w:type="dxa" w:w="1440"/>
+            <w:shd w:fill="EEF3F8"/>
+            <w:vAlign w:val="center"/>
+          </w:tcPr>
+          <w:p>
+            <w:pPr>
+              <w:spacing w:after="0" w:before="0"/>
+              <w:jc w:val="center"/>
+            </w:pPr>
+            <w:r>
+              <w:rPr>
+                <w:rFonts w:ascii="Aptos" w:hAnsi="Aptos"/>
+                <w:b w:val="0"/>
+                <w:color w:val="1F2937"/>
+                <w:sz w:val="18"/>
+              </w:rPr>
+              <w:t>EINGEBUNDEN / QA</w:t>
+            </w:r>
+          </w:p>
+        </w:tc>
+        <w:tc>
+          <w:tcPr>
+            <w:tcW w:type="dxa" w:w="3312"/>
+            <w:shd w:fill="EEF3F8"/>
+            <w:vAlign w:val="center"/>
+          </w:tcPr>
+          <w:p>
+            <w:pPr>
+              <w:spacing w:after="0" w:before="0"/>
+              <w:jc w:val="left"/>
+            </w:pPr>
+            <w:r>
+              <w:rPr>
+                <w:rFonts w:ascii="Aptos" w:hAnsi="Aptos"/>
+                <w:b w:val="0"/>
+                <w:color w:val="1F2937"/>
+                <w:sz w:val="18"/>
+              </w:rPr>
+              <w:t>Eigene Entity, Spawn-Ei, Renderer, Mesh und Textur sind vorhanden.</w:t>
+            </w:r>
+          </w:p>
+        </w:tc>
+        <w:tc>
+          <w:tcPr>
+            <w:tcW w:type="dxa" w:w="3024"/>
+            <w:shd w:fill="EEF3F8"/>
+            <w:vAlign w:val="center"/>
+          </w:tcPr>
+          <w:p>
+            <w:pPr>
+              <w:spacing w:after="0" w:before="0"/>
+              <w:jc w:val="left"/>
+            </w:pPr>
+            <w:r>
+              <w:rPr>
+                <w:rFonts w:ascii="Aptos" w:hAnsi="Aptos"/>
+                <w:b w:val="0"/>
+                <w:color w:val="1F2937"/>
+                <w:sz w:val="18"/>
+              </w:rPr>
+              <w:t>Bodenkontakt, Laufrichtung und Rekrutierungsverhalten prüfen.</w:t>
+            </w:r>
+          </w:p>
+        </w:tc>
+      </w:tr>
+      <w:tr>
+        <w:tc>
+          <w:tcPr>
+            <w:tcW w:type="dxa" w:w="1584"/>
+            <w:vAlign w:val="center"/>
+          </w:tcPr>
+          <w:p>
+            <w:pPr>
+              <w:spacing w:after="0" w:before="0"/>
+              <w:jc w:val="left"/>
+            </w:pPr>
+            <w:r>
+              <w:rPr>
+                <w:rFonts w:ascii="Aptos" w:hAnsi="Aptos"/>
+                <w:b/>
+                <w:color w:val="1F2937"/>
+                <w:sz w:val="18"/>
+              </w:rPr>
+              <w:t>Living Bat</w:t>
+            </w:r>
+          </w:p>
+        </w:tc>
+        <w:tc>
+          <w:tcPr>
+            <w:tcW w:type="dxa" w:w="1440"/>
+            <w:vAlign w:val="center"/>
+          </w:tcPr>
+          <w:p>
+            <w:pPr>
+              <w:spacing w:after="0" w:before="0"/>
+              <w:jc w:val="center"/>
+            </w:pPr>
+            <w:r>
+              <w:rPr>
+                <w:rFonts w:ascii="Aptos" w:hAnsi="Aptos"/>
+                <w:b w:val="0"/>
+                <w:color w:val="1F2937"/>
+                <w:sz w:val="18"/>
+              </w:rPr>
+              <w:t>EINGEBUNDEN / QA</w:t>
+            </w:r>
+          </w:p>
+        </w:tc>
+        <w:tc>
+          <w:tcPr>
+            <w:tcW w:type="dxa" w:w="3312"/>
+            <w:vAlign w:val="center"/>
+          </w:tcPr>
+          <w:p>
+            <w:pPr>
+              <w:spacing w:after="0" w:before="0"/>
+              <w:jc w:val="left"/>
+            </w:pPr>
+            <w:r>
+              <w:rPr>
+                <w:rFonts w:ascii="Aptos" w:hAnsi="Aptos"/>
+                <w:b w:val="0"/>
+                <w:color w:val="1F2937"/>
+                <w:sz w:val="18"/>
+              </w:rPr>
+              <w:t>Eigene Entity, Spawn-Ei, Renderer, Mesh, Textur und Fähigkeiten sind vorhanden.</w:t>
+            </w:r>
+          </w:p>
+        </w:tc>
+        <w:tc>
+          <w:tcPr>
+            <w:tcW w:type="dxa" w:w="3024"/>
+            <w:vAlign w:val="center"/>
+          </w:tcPr>
+          <w:p>
+            <w:pPr>
+              <w:spacing w:after="0" w:before="0"/>
+              <w:jc w:val="left"/>
+            </w:pPr>
+            <w:r>
+              <w:rPr>
+                <w:rFonts w:ascii="Aptos" w:hAnsi="Aptos"/>
+                <w:b w:val="0"/>
+                <w:color w:val="1F2937"/>
+                <w:sz w:val="18"/>
+              </w:rPr>
+              <w:t>Fluganimation und Kollisionsgrösse prüfen.</w:t>
+            </w:r>
+          </w:p>
+        </w:tc>
+      </w:tr>
+      <w:tr>
+        <w:tc>
+          <w:tcPr>
+            <w:tcW w:type="dxa" w:w="1584"/>
+            <w:shd w:fill="EEF3F8"/>
+            <w:vAlign w:val="center"/>
+          </w:tcPr>
+          <w:p>
+            <w:pPr>
+              <w:spacing w:after="0" w:before="0"/>
+              <w:jc w:val="left"/>
+            </w:pPr>
+            <w:r>
+              <w:rPr>
+                <w:rFonts w:ascii="Aptos" w:hAnsi="Aptos"/>
+                <w:b/>
+                <w:color w:val="1F2937"/>
+                <w:sz w:val="18"/>
+              </w:rPr>
+              <w:t>Rooted Husk</w:t>
+            </w:r>
+          </w:p>
+        </w:tc>
+        <w:tc>
+          <w:tcPr>
+            <w:tcW w:type="dxa" w:w="1440"/>
+            <w:shd w:fill="EEF3F8"/>
+            <w:vAlign w:val="center"/>
+          </w:tcPr>
+          <w:p>
+            <w:pPr>
+              <w:spacing w:after="0" w:before="0"/>
+              <w:jc w:val="center"/>
+            </w:pPr>
+            <w:r>
+              <w:rPr>
+                <w:rFonts w:ascii="Aptos" w:hAnsi="Aptos"/>
+                <w:b w:val="0"/>
+                <w:color w:val="1F2937"/>
+                <w:sz w:val="18"/>
+              </w:rPr>
+              <w:t>EINGEBUNDEN / QA</w:t>
+            </w:r>
+          </w:p>
+        </w:tc>
+        <w:tc>
+          <w:tcPr>
+            <w:tcW w:type="dxa" w:w="3312"/>
+            <w:shd w:fill="EEF3F8"/>
+            <w:vAlign w:val="center"/>
+          </w:tcPr>
+          <w:p>
+            <w:pPr>
+              <w:spacing w:after="0" w:before="0"/>
+              <w:jc w:val="left"/>
+            </w:pPr>
+            <w:r>
+              <w:rPr>
+                <w:rFonts w:ascii="Aptos" w:hAnsi="Aptos"/>
+                <w:b w:val="0"/>
+                <w:color w:val="1F2937"/>
+                <w:sz w:val="18"/>
+              </w:rPr>
+              <w:t>Eigene Entity, Spawn-Ei, Renderer, Mesh, Textur und Fähigkeiten sind vorhanden.</w:t>
+            </w:r>
+          </w:p>
+        </w:tc>
+        <w:tc>
+          <w:tcPr>
+            <w:tcW w:type="dxa" w:w="3024"/>
+            <w:shd w:fill="EEF3F8"/>
+            <w:vAlign w:val="center"/>
+          </w:tcPr>
+          <w:p>
+            <w:pPr>
+              <w:spacing w:after="0" w:before="0"/>
+              <w:jc w:val="left"/>
+            </w:pPr>
+            <w:r>
+              <w:rPr>
+                <w:rFonts w:ascii="Aptos" w:hAnsi="Aptos"/>
+                <w:b w:val="0"/>
+                <w:color w:val="1F2937"/>
+                <w:sz w:val="18"/>
+              </w:rPr>
+              <w:t>Bodenhöhe, Laufrichtung und Modellgrösse prüfen.</w:t>
+            </w:r>
+          </w:p>
+        </w:tc>
+      </w:tr>
+      <w:tr>
+        <w:tc>
+          <w:tcPr>
+            <w:tcW w:type="dxa" w:w="1584"/>
+            <w:vAlign w:val="center"/>
+          </w:tcPr>
+          <w:p>
+            <w:pPr>
+              <w:spacing w:after="0" w:before="0"/>
+              <w:jc w:val="left"/>
+            </w:pPr>
+            <w:r>
+              <w:rPr>
+                <w:rFonts w:ascii="Aptos" w:hAnsi="Aptos"/>
+                <w:b/>
+                <w:color w:val="1F2937"/>
+                <w:sz w:val="18"/>
+              </w:rPr>
+              <w:t>Web Cave Spider</w:t>
+            </w:r>
+          </w:p>
+        </w:tc>
+        <w:tc>
+          <w:tcPr>
+            <w:tcW w:type="dxa" w:w="1440"/>
+            <w:vAlign w:val="center"/>
+          </w:tcPr>
+          <w:p>
+            <w:pPr>
+              <w:spacing w:after="0" w:before="0"/>
+              <w:jc w:val="center"/>
+            </w:pPr>
+            <w:r>
+              <w:rPr>
+                <w:rFonts w:ascii="Aptos" w:hAnsi="Aptos"/>
+                <w:b w:val="0"/>
+                <w:color w:val="1F2937"/>
+                <w:sz w:val="18"/>
+              </w:rPr>
+              <w:t>EINGEBUNDEN / QA</w:t>
+            </w:r>
+          </w:p>
+        </w:tc>
+        <w:tc>
+          <w:tcPr>
+            <w:tcW w:type="dxa" w:w="3312"/>
+            <w:vAlign w:val="center"/>
+          </w:tcPr>
+          <w:p>
+            <w:pPr>
+              <w:spacing w:after="0" w:before="0"/>
+              <w:jc w:val="left"/>
+            </w:pPr>
+            <w:r>
+              <w:rPr>
+                <w:rFonts w:ascii="Aptos" w:hAnsi="Aptos"/>
+                <w:b w:val="0"/>
+                <w:color w:val="1F2937"/>
+                <w:sz w:val="18"/>
+              </w:rPr>
+              <w:t>Eigene Entity, Renderer, Mesh, Textur, Netzangriff und Sounds sind vorhanden.</w:t>
+            </w:r>
+          </w:p>
+        </w:tc>
+        <w:tc>
+          <w:tcPr>
+            <w:tcW w:type="dxa" w:w="3024"/>
+            <w:vAlign w:val="center"/>
+          </w:tcPr>
+          <w:p>
+            <w:pPr>
+              <w:spacing w:after="0" w:before="0"/>
+              <w:jc w:val="left"/>
+            </w:pPr>
+            <w:r>
+              <w:rPr>
+                <w:rFonts w:ascii="Aptos" w:hAnsi="Aptos"/>
+                <w:b w:val="0"/>
+                <w:color w:val="1F2937"/>
+                <w:sz w:val="18"/>
+              </w:rPr>
+              <w:t>Bodenkontakt, Laufrichtung und Beinanimation prüfen.</w:t>
+            </w:r>
+          </w:p>
+        </w:tc>
+      </w:tr>
+      <w:tr>
+        <w:tc>
+          <w:tcPr>
+            <w:tcW w:type="dxa" w:w="1584"/>
+            <w:shd w:fill="EEF3F8"/>
+            <w:vAlign w:val="center"/>
+          </w:tcPr>
+          <w:p>
+            <w:pPr>
+              <w:spacing w:after="0" w:before="0"/>
+              <w:jc w:val="left"/>
+            </w:pPr>
+            <w:r>
+              <w:rPr>
+                <w:rFonts w:ascii="Aptos" w:hAnsi="Aptos"/>
+                <w:b/>
+                <w:color w:val="1F2937"/>
+                <w:sz w:val="18"/>
+              </w:rPr>
+              <w:t>Living Boss</w:t>
+            </w:r>
+          </w:p>
+        </w:tc>
+        <w:tc>
+          <w:tcPr>
+            <w:tcW w:type="dxa" w:w="1440"/>
+            <w:shd w:fill="EEF3F8"/>
+            <w:vAlign w:val="center"/>
+          </w:tcPr>
+          <w:p>
+            <w:pPr>
+              <w:spacing w:after="0" w:before="0"/>
+              <w:jc w:val="center"/>
+            </w:pPr>
+            <w:r>
+              <w:rPr>
+                <w:rFonts w:ascii="Aptos" w:hAnsi="Aptos"/>
+                <w:b w:val="0"/>
+                <w:color w:val="1F2937"/>
+                <w:sz w:val="18"/>
+              </w:rPr>
+              <w:t>EINGEBUNDEN / QA</w:t>
+            </w:r>
+          </w:p>
+        </w:tc>
+        <w:tc>
+          <w:tcPr>
+            <w:tcW w:type="dxa" w:w="3312"/>
+            <w:shd w:fill="EEF3F8"/>
+            <w:vAlign w:val="center"/>
+          </w:tcPr>
+          <w:p>
+            <w:pPr>
+              <w:spacing w:after="0" w:before="0"/>
+              <w:jc w:val="left"/>
+            </w:pPr>
+            <w:r>
+              <w:rPr>
+                <w:rFonts w:ascii="Aptos" w:hAnsi="Aptos"/>
+                <w:b w:val="0"/>
+                <w:color w:val="1F2937"/>
+                <w:sz w:val="18"/>
+              </w:rPr>
+              <w:t>Boss-Entity, Renderer, Tripo-Mesh, 4K-Textur, Phasen, Spezialangriffe und Schwierigkeitsprofile sind vorhanden.</w:t>
+            </w:r>
+          </w:p>
+        </w:tc>
+        <w:tc>
+          <w:tcPr>
+            <w:tcW w:type="dxa" w:w="3024"/>
+            <w:shd w:fill="EEF3F8"/>
+            <w:vAlign w:val="center"/>
+          </w:tcPr>
+          <w:p>
+            <w:pPr>
+              <w:spacing w:after="0" w:before="0"/>
+              <w:jc w:val="left"/>
+            </w:pPr>
+            <w:r>
+              <w:rPr>
+                <w:rFonts w:ascii="Aptos" w:hAnsi="Aptos"/>
+                <w:b w:val="0"/>
+                <w:color w:val="1F2937"/>
+                <w:sz w:val="18"/>
+              </w:rPr>
+              <w:t>Boss-Grösse, Bodenkontakt und visuellen Schwerpunkt im Spiel prüfen.</w:t>
+            </w:r>
+          </w:p>
+        </w:tc>
+      </w:tr>
+      <w:tr>
+        <w:tc>
+          <w:tcPr>
+            <w:tcW w:type="dxa" w:w="1584"/>
+            <w:vAlign w:val="center"/>
+          </w:tcPr>
+          <w:p>
+            <w:pPr>
+              <w:spacing w:after="0" w:before="0"/>
+              <w:jc w:val="left"/>
+            </w:pPr>
+            <w:r>
+              <w:rPr>
+                <w:rFonts w:ascii="Aptos" w:hAnsi="Aptos"/>
+                <w:b/>
+                <w:color w:val="1F2937"/>
+                <w:sz w:val="18"/>
+              </w:rPr>
+              <w:t>Witch Boss</w:t>
+            </w:r>
+          </w:p>
+        </w:tc>
+        <w:tc>
+          <w:tcPr>
+            <w:tcW w:type="dxa" w:w="1440"/>
+            <w:vAlign w:val="center"/>
+          </w:tcPr>
+          <w:p>
+            <w:pPr>
+              <w:spacing w:after="0" w:before="0"/>
+              <w:jc w:val="center"/>
+            </w:pPr>
+            <w:r>
+              <w:rPr>
+                <w:rFonts w:ascii="Aptos" w:hAnsi="Aptos"/>
+                <w:b w:val="0"/>
+                <w:color w:val="1F2937"/>
+                <w:sz w:val="18"/>
+              </w:rPr>
+              <w:t>EINGEBUNDEN / QA</w:t>
+            </w:r>
+          </w:p>
+        </w:tc>
+        <w:tc>
+          <w:tcPr>
+            <w:tcW w:type="dxa" w:w="3312"/>
+            <w:vAlign w:val="center"/>
+          </w:tcPr>
+          <w:p>
+            <w:pPr>
+              <w:spacing w:after="0" w:before="0"/>
+              <w:jc w:val="left"/>
+            </w:pPr>
+            <w:r>
+              <w:rPr>
+                <w:rFonts w:ascii="Aptos" w:hAnsi="Aptos"/>
+                <w:b w:val="0"/>
+                <w:color w:val="1F2937"/>
+                <w:sz w:val="18"/>
+              </w:rPr>
+              <w:t>Boss-Entity, Renderer, Tripo-Mesh, 4K-Textur, Hasenform und Jagdphase sind vorhanden.</w:t>
+            </w:r>
+          </w:p>
+        </w:tc>
+        <w:tc>
+          <w:tcPr>
+            <w:tcW w:type="dxa" w:w="3024"/>
+            <w:vAlign w:val="center"/>
+          </w:tcPr>
+          <w:p>
+            <w:pPr>
+              <w:spacing w:after="0" w:before="0"/>
+              <w:jc w:val="left"/>
+            </w:pPr>
+            <w:r>
+              <w:rPr>
+                <w:rFonts w:ascii="Aptos" w:hAnsi="Aptos"/>
+                <w:b w:val="0"/>
+                <w:color w:val="1F2937"/>
+                <w:sz w:val="18"/>
+              </w:rPr>
+              <w:t>Bossfight und Hasen-Verwandlung vollständig im Spiel testen.</w:t>
+            </w:r>
+          </w:p>
+        </w:tc>
+      </w:tr>
+    </w:tbl>
     <w:sectPr>
       <w:pgSz w:w="11906" w:h="16838"/>
       <w:pgMar w:top="1152" w:right="1008" w:bottom="1152" w:left="1008" w:header="708" w:footer="708" w:gutter="0"/>

</xml_diff>